<commit_message>
Update Terms of Service with new last updated date and revised purchase policies
</commit_message>
<xml_diff>
--- a/NIHPLOD服务条款.docx
+++ b/NIHPLOD服务条款.docx
@@ -183,77 +183,49 @@
           <w:sz w:val="21"/>
           <w:szCs w:val="21"/>
         </w:rPr>
-        <w:t xml:space="preserve">在线上服务订购产品可能通过第三方服务商或授权经销商协助完成。我们将尽合理努力确保第三方服务商和经销商具备合法资质并提供符合质量标准的产品和服务。</w:t>
-      </w:r>
-    </w:p>
-    <w:p>
-      <w:pPr>
-        <w:spacing w:after="60" w:before="60"/>
-        <w:ind w:firstLine="420"/>
-      </w:pPr>
-      <w:r>
-        <w:rPr>
-          <w:rFonts w:ascii="SimSun" w:cs="SimSun" w:eastAsia="SimSun" w:hAnsi="SimSun"/>
-          <w:sz w:val="21"/>
-          <w:szCs w:val="21"/>
-        </w:rPr>
-        <w:t xml:space="preserve">3.1 支付方式</w:t>
-      </w:r>
-    </w:p>
-    <w:p>
-      <w:pPr>
-        <w:spacing w:after="60" w:before="60"/>
-        <w:ind w:firstLine="420"/>
-      </w:pPr>
-      <w:r>
-        <w:rPr>
-          <w:rFonts w:ascii="SimSun" w:cs="SimSun" w:eastAsia="SimSun" w:hAnsi="SimSun"/>
-          <w:sz w:val="21"/>
-          <w:szCs w:val="21"/>
-        </w:rPr>
-        <w:t xml:space="preserve">我们目前支持微信支付和支付宝两种在线支付方式。您下单后可在支付页面选择您偏好的支付方式完成付款。</w:t>
-      </w:r>
-    </w:p>
-    <w:p>
-      <w:pPr>
-        <w:spacing w:after="60" w:before="60"/>
-        <w:ind w:firstLine="420"/>
-      </w:pPr>
-      <w:r>
-        <w:rPr>
-          <w:rFonts w:ascii="SimSun" w:cs="SimSun" w:eastAsia="SimSun" w:hAnsi="SimSun"/>
-          <w:sz w:val="21"/>
-          <w:szCs w:val="21"/>
-        </w:rPr>
-        <w:t xml:space="preserve">3.2 支付超时与订单自动取消</w:t>
-      </w:r>
-    </w:p>
-    <w:p>
-      <w:pPr>
-        <w:spacing w:after="60" w:before="60"/>
-        <w:ind w:firstLine="420"/>
-      </w:pPr>
-      <w:r>
-        <w:rPr>
-          <w:rFonts w:ascii="SimSun" w:cs="SimSun" w:eastAsia="SimSun" w:hAnsi="SimSun"/>
-          <w:sz w:val="21"/>
-          <w:szCs w:val="21"/>
-        </w:rPr>
-        <w:t xml:space="preserve">您下单后应在30分钟内完成支付。如您未在30分钟内完成支付，系统将自动取消该订单并释放库存。订单取消后，如您仍希望购买相同商品，需重新下单。</w:t>
-      </w:r>
-    </w:p>
-    <w:p>
-      <w:pPr>
-        <w:spacing w:after="60" w:before="60"/>
-        <w:ind w:firstLine="420"/>
-      </w:pPr>
-      <w:r>
-        <w:rPr>
-          <w:rFonts w:ascii="SimSun" w:cs="SimSun" w:eastAsia="SimSun" w:hAnsi="SimSun"/>
-          <w:sz w:val="21"/>
-          <w:szCs w:val="21"/>
-        </w:rPr>
-        <w:t xml:space="preserve">3.3 第三方服务</w:t>
+        <w:t xml:space="preserve">我们的产品通过第三方平台（如天猫、京东、抖音、小红书等）及授权经销商销售，本线上服务不提供直接购买功能。我们将尽合理努力确保第三方服务商和经销商具备合法资质并提供符合质量标准的产品和服务。</w:t>
+      </w:r>
+    </w:p>
+    <w:p>
+      <w:pPr>
+        <w:spacing w:after="60" w:before="60"/>
+        <w:ind w:firstLine="420"/>
+      </w:pPr>
+      <w:r>
+        <w:rPr>
+          <w:rFonts w:ascii="SimSun" w:cs="SimSun" w:eastAsia="SimSun" w:hAnsi="SimSun"/>
+          <w:sz w:val="21"/>
+          <w:szCs w:val="21"/>
+        </w:rPr>
+        <w:t xml:space="preserve">3.1 支付与订单</w:t>
+      </w:r>
+    </w:p>
+    <w:p>
+      <w:pPr>
+        <w:spacing w:after="60" w:before="60"/>
+        <w:ind w:firstLine="420"/>
+      </w:pPr>
+      <w:r>
+        <w:rPr>
+          <w:rFonts w:ascii="SimSun" w:cs="SimSun" w:eastAsia="SimSun" w:hAnsi="SimSun"/>
+          <w:sz w:val="21"/>
+          <w:szCs w:val="21"/>
+        </w:rPr>
+        <w:t xml:space="preserve">通过第三方平台购买时，支付方式、订单管理、支付时限等以各平台的规则和页面展示为准，相关交易受该第三方的条款和政策约束。</w:t>
+      </w:r>
+    </w:p>
+    <w:p>
+      <w:pPr>
+        <w:spacing w:after="60" w:before="60"/>
+        <w:ind w:firstLine="420"/>
+      </w:pPr>
+      <w:r>
+        <w:rPr>
+          <w:rFonts w:ascii="SimSun" w:cs="SimSun" w:eastAsia="SimSun" w:hAnsi="SimSun"/>
+          <w:sz w:val="21"/>
+          <w:szCs w:val="21"/>
+        </w:rPr>
+        <w:t xml:space="preserve">3.2 第三方服务</w:t>
       </w:r>
     </w:p>
     <w:p>
@@ -505,7 +477,7 @@
           <w:sz w:val="21"/>
           <w:szCs w:val="21"/>
         </w:rPr>
-        <w:t xml:space="preserve">我们收到退回商品并确认符合退货条件后，将在七日内将款项原路退回至您的支付账户。如因我方原因延迟退款，我方将依法承担相应责任。</w:t>
+        <w:t xml:space="preserve">通过第三方平台购买的商品，退款按该平台的退款流程原路退回至您的支付账户；通过授权经销商购买的商品，由经销商按原支付方式办理退款。如因我方原因延迟退款，我方将依法承担相应责任。</w:t>
       </w:r>
     </w:p>
     <w:p>
@@ -3347,7 +3319,7 @@
           <w:sz w:val="21"/>
           <w:szCs w:val="21"/>
         </w:rPr>
-        <w:t xml:space="preserve">25. 礼遇券与线上优惠券</w:t>
+        <w:t xml:space="preserve">25. 礼遇券</w:t>
       </w:r>
     </w:p>
     <w:p>
@@ -3459,147 +3431,21 @@
           <w:sz w:val="21"/>
           <w:szCs w:val="21"/>
         </w:rPr>
-        <w:t xml:space="preserve">25.3 线上商城优惠券</w:t>
-      </w:r>
-    </w:p>
-    <w:p>
-      <w:pPr>
-        <w:spacing w:after="60" w:before="60"/>
-        <w:ind w:firstLine="420"/>
-      </w:pPr>
-      <w:r>
-        <w:rPr>
-          <w:rFonts w:ascii="SimSun" w:cs="SimSun" w:eastAsia="SimSun" w:hAnsi="SimSun"/>
-          <w:sz w:val="21"/>
-          <w:szCs w:val="21"/>
-        </w:rPr>
-        <w:t xml:space="preserve">除线下礼遇券外，我们可能通过线上商城向您发放优惠券（包括满减券、折扣券等）。线上优惠券适用以下规则：</w:t>
-      </w:r>
-    </w:p>
-    <w:p>
-      <w:pPr>
-        <w:spacing w:after="60" w:before="60"/>
-        <w:ind w:firstLine="420"/>
-      </w:pPr>
-      <w:r>
-        <w:rPr>
-          <w:rFonts w:ascii="SimSun" w:cs="SimSun" w:eastAsia="SimSun" w:hAnsi="SimSun"/>
-          <w:sz w:val="21"/>
-          <w:szCs w:val="21"/>
-        </w:rPr>
-        <w:t xml:space="preserve">(1) 领取规则：每张优惠券设有总发行量和每人限领张数，领完即止。您可在商城活动页面点击领取或使用兑换码领取。</w:t>
-      </w:r>
-    </w:p>
-    <w:p>
-      <w:pPr>
-        <w:spacing w:after="60" w:before="60"/>
-        <w:ind w:firstLine="420"/>
-      </w:pPr>
-      <w:r>
-        <w:rPr>
-          <w:rFonts w:ascii="SimSun" w:cs="SimSun" w:eastAsia="SimSun" w:hAnsi="SimSun"/>
-          <w:sz w:val="21"/>
-          <w:szCs w:val="21"/>
-        </w:rPr>
-        <w:t xml:space="preserve">(2) 有效期：优惠券的有效期以券面展示为准，可能为固定日期区间或领取后若干天内有效。超过有效期后优惠券自动失效，不予补发或延期。</w:t>
-      </w:r>
-    </w:p>
-    <w:p>
-      <w:pPr>
-        <w:spacing w:after="60" w:before="60"/>
-        <w:ind w:firstLine="420"/>
-      </w:pPr>
-      <w:r>
-        <w:rPr>
-          <w:rFonts w:ascii="SimSun" w:cs="SimSun" w:eastAsia="SimSun" w:hAnsi="SimSun"/>
-          <w:sz w:val="21"/>
-          <w:szCs w:val="21"/>
-        </w:rPr>
-        <w:t xml:space="preserve">(3) 使用门槛：部分优惠券设有最低消费金额（满减门槛），订单金额满足门槛时方可使用。</w:t>
-      </w:r>
-    </w:p>
-    <w:p>
-      <w:pPr>
-        <w:spacing w:after="60" w:before="60"/>
-        <w:ind w:firstLine="420"/>
-      </w:pPr>
-      <w:r>
-        <w:rPr>
-          <w:rFonts w:ascii="SimSun" w:cs="SimSun" w:eastAsia="SimSun" w:hAnsi="SimSun"/>
-          <w:sz w:val="21"/>
-          <w:szCs w:val="21"/>
-        </w:rPr>
-        <w:t xml:space="preserve">(4) 不可兑现：优惠券不可兑换现金、不设找零，不可转让（另有说明的除外）。</w:t>
-      </w:r>
-    </w:p>
-    <w:p>
-      <w:pPr>
-        <w:spacing w:after="60" w:before="60"/>
-        <w:ind w:firstLine="420"/>
-      </w:pPr>
-      <w:r>
-        <w:rPr>
-          <w:rFonts w:ascii="SimSun" w:cs="SimSun" w:eastAsia="SimSun" w:hAnsi="SimSun"/>
-          <w:sz w:val="21"/>
-          <w:szCs w:val="21"/>
-        </w:rPr>
-        <w:t xml:space="preserve">(5) 叠加规则：每笔订单仅可使用一张优惠券，不可与其他优惠叠加，除非另有明确说明。</w:t>
-      </w:r>
-    </w:p>
-    <w:p>
-      <w:pPr>
-        <w:spacing w:after="60" w:before="60"/>
-        <w:ind w:firstLine="420"/>
-      </w:pPr>
-      <w:r>
-        <w:rPr>
-          <w:rFonts w:ascii="SimSun" w:cs="SimSun" w:eastAsia="SimSun" w:hAnsi="SimSun"/>
-          <w:sz w:val="21"/>
-          <w:szCs w:val="21"/>
-        </w:rPr>
-        <w:t xml:space="preserve">(6) 退款处理：如您使用优惠券的订单发生全额退款，优惠券将退回至您的账户（如券仍在有效期内）；如发生部分退款，优惠券不予退回。</w:t>
-      </w:r>
-    </w:p>
-    <w:p>
-      <w:pPr>
-        <w:spacing w:after="60" w:before="60"/>
-        <w:ind w:firstLine="420"/>
-      </w:pPr>
-      <w:r>
-        <w:rPr>
-          <w:rFonts w:ascii="SimSun" w:cs="SimSun" w:eastAsia="SimSun" w:hAnsi="SimSun"/>
-          <w:sz w:val="21"/>
-          <w:szCs w:val="21"/>
-        </w:rPr>
-        <w:t xml:space="preserve">(7) 账户注销影响：如您注销账户，账户内所有未使用的优惠券将自动失效。</w:t>
-      </w:r>
-    </w:p>
-    <w:p>
-      <w:pPr>
-        <w:spacing w:after="60" w:before="60"/>
-        <w:ind w:firstLine="420"/>
-      </w:pPr>
-      <w:r>
-        <w:rPr>
-          <w:rFonts w:ascii="SimSun" w:cs="SimSun" w:eastAsia="SimSun" w:hAnsi="SimSun"/>
-          <w:sz w:val="21"/>
-          <w:szCs w:val="21"/>
-        </w:rPr>
-        <w:t xml:space="preserve">25.4 免责</w:t>
-      </w:r>
-    </w:p>
-    <w:p>
-      <w:pPr>
-        <w:spacing w:after="60" w:before="60"/>
-        <w:ind w:firstLine="420"/>
-      </w:pPr>
-      <w:r>
-        <w:rPr>
-          <w:rFonts w:ascii="SimSun" w:cs="SimSun" w:eastAsia="SimSun" w:hAnsi="SimSun"/>
-          <w:sz w:val="21"/>
-          <w:szCs w:val="21"/>
-        </w:rPr>
-        <w:t xml:space="preserve">礼遇券及优惠券为免费或附带赠品性质，我们不保证其所对应的服务或优惠一定满足您的个人期望。发放活动如因不可抗力或其他正当理由需要调整或取消的，我们将通过合理方式通知您。券面展示图片仅供参考，具体服务内容以实际提供为准。</w:t>
+        <w:t xml:space="preserve">25.3 免责</w:t>
+      </w:r>
+    </w:p>
+    <w:p>
+      <w:pPr>
+        <w:spacing w:after="60" w:before="60"/>
+        <w:ind w:firstLine="420"/>
+      </w:pPr>
+      <w:r>
+        <w:rPr>
+          <w:rFonts w:ascii="SimSun" w:cs="SimSun" w:eastAsia="SimSun" w:hAnsi="SimSun"/>
+          <w:sz w:val="21"/>
+          <w:szCs w:val="21"/>
+        </w:rPr>
+        <w:t xml:space="preserve">礼遇券为免费或附带赠品性质，我们不保证其所对应的服务或优惠一定满足您的个人期望。发放活动如因不可抗力或其他正当理由需要调整或取消的，我们将通过合理方式通知您。券面展示图片仅供参考，具体服务内容以实际提供为准。</w:t>
       </w:r>
     </w:p>
     <w:p>

</xml_diff>